<commit_message>
update templeat to V3
</commit_message>
<xml_diff>
--- a/TravelPlanning/Templates/旅遊行程套版_v3.docx
+++ b/TravelPlanning/Templates/旅遊行程套版_v3.docx
@@ -52,65 +52,33 @@
               <w:spacing w:after="260"/>
               <w:jc w:val="center"/>
             </w:pPr>
-            <w:r>
-              <w:fldChar w:fldCharType="begin"/>
-            </w:r>
-            <w:r>
-              <w:instrText xml:space="preserve"> MERGEFIELD TripName </w:instrText>
-            </w:r>
-            <w:r>
-              <w:fldChar w:fldCharType="separate"/>
-            </w:r>
-            <w:r>
-              <w:rPr>
-                <w:b/>
-                <w:bCs/>
-                <w:color w:val="FFFFFF"/>
-                <w:sz w:val="64"/>
-                <w:szCs w:val="64"/>
-              </w:rPr>
-              <w:t>«TripName»</w:t>
-            </w:r>
-            <w:r>
-              <w:rPr>
-                <w:b/>
-                <w:bCs/>
-                <w:color w:val="FFFFFF"/>
-                <w:sz w:val="64"/>
-                <w:szCs w:val="64"/>
-              </w:rPr>
-              <w:fldChar w:fldCharType="end"/>
-            </w:r>
+            <w:fldSimple w:instr=" MERGEFIELD TripName ">
+              <w:r>
+                <w:rPr>
+                  <w:b/>
+                  <w:bCs/>
+                  <w:color w:val="FFFFFF"/>
+                  <w:sz w:val="64"/>
+                  <w:szCs w:val="64"/>
+                </w:rPr>
+                <w:t>«TripName»</w:t>
+              </w:r>
+            </w:fldSimple>
           </w:p>
           <w:p>
             <w:pPr>
               <w:jc w:val="center"/>
             </w:pPr>
-            <w:r>
-              <w:fldChar w:fldCharType="begin"/>
-            </w:r>
-            <w:r>
-              <w:instrText xml:space="preserve"> MERGEFIELD StartDate </w:instrText>
-            </w:r>
-            <w:r>
-              <w:fldChar w:fldCharType="separate"/>
-            </w:r>
-            <w:r>
-              <w:rPr>
-                <w:color w:val="FFFFFF"/>
-                <w:sz w:val="24"/>
-                <w:szCs w:val="24"/>
-              </w:rPr>
-              <w:t>«StartDate»</w:t>
-            </w:r>
-            <w:r>
-              <w:rPr>
-                <w:color w:val="FFFFFF"/>
-                <w:sz w:val="24"/>
-                <w:szCs w:val="24"/>
-              </w:rPr>
-              <w:fldChar w:fldCharType="end"/>
-            </w:r>
+            <w:fldSimple w:instr=" MERGEFIELD StartDate ">
+              <w:r>
+                <w:rPr>
+                  <w:color w:val="FFFFFF"/>
+                  <w:sz w:val="24"/>
+                  <w:szCs w:val="24"/>
+                </w:rPr>
+                <w:t>«StartDate»</w:t>
+              </w:r>
+            </w:fldSimple>
             <w:r>
               <w:rPr>
                 <w:color w:val="C9973A"/>
@@ -119,31 +87,16 @@
               </w:rPr>
               <w:t xml:space="preserve">  —  </w:t>
             </w:r>
-            <w:r>
-              <w:fldChar w:fldCharType="begin"/>
-            </w:r>
-            <w:r>
-              <w:instrText xml:space="preserve"> MERGEFIELD EndDate </w:instrText>
-            </w:r>
-            <w:r>
-              <w:fldChar w:fldCharType="separate"/>
-            </w:r>
-            <w:r>
-              <w:rPr>
-                <w:color w:val="FFFFFF"/>
-                <w:sz w:val="24"/>
-                <w:szCs w:val="24"/>
-              </w:rPr>
-              <w:t>«EndDate»</w:t>
-            </w:r>
-            <w:r>
-              <w:rPr>
-                <w:color w:val="FFFFFF"/>
-                <w:sz w:val="24"/>
-                <w:szCs w:val="24"/>
-              </w:rPr>
-              <w:fldChar w:fldCharType="end"/>
-            </w:r>
+            <w:fldSimple w:instr=" MERGEFIELD EndDate ">
+              <w:r>
+                <w:rPr>
+                  <w:color w:val="FFFFFF"/>
+                  <w:sz w:val="24"/>
+                  <w:szCs w:val="24"/>
+                </w:rPr>
+                <w:t>«EndDate»</w:t>
+              </w:r>
+            </w:fldSimple>
           </w:p>
           <w:p>
             <w:pPr>
@@ -158,35 +111,18 @@
               </w:rPr>
               <w:t xml:space="preserve">共 </w:t>
             </w:r>
-            <w:r>
-              <w:fldChar w:fldCharType="begin"/>
-            </w:r>
-            <w:r>
-              <w:instrText xml:space="preserve"> MERGEFIELD TotalDays </w:instrText>
-            </w:r>
-            <w:r>
-              <w:fldChar w:fldCharType="separate"/>
-            </w:r>
-            <w:r>
-              <w:rPr>
-                <w:b/>
-                <w:bCs/>
-                <w:color w:val="C9973A"/>
-                <w:sz w:val="20"/>
-                <w:szCs w:val="20"/>
-              </w:rPr>
-              <w:t>«TotalDays»</w:t>
-            </w:r>
-            <w:r>
-              <w:rPr>
-                <w:b/>
-                <w:bCs/>
-                <w:color w:val="C9973A"/>
-                <w:sz w:val="20"/>
-                <w:szCs w:val="20"/>
-              </w:rPr>
-              <w:fldChar w:fldCharType="end"/>
-            </w:r>
+            <w:fldSimple w:instr=" MERGEFIELD TotalDays ">
+              <w:r>
+                <w:rPr>
+                  <w:b/>
+                  <w:bCs/>
+                  <w:color w:val="C9973A"/>
+                  <w:sz w:val="20"/>
+                  <w:szCs w:val="20"/>
+                </w:rPr>
+                <w:t>«TotalDays»</w:t>
+              </w:r>
+            </w:fldSimple>
             <w:r>
               <w:rPr>
                 <w:color w:val="CFCFCF"/>
@@ -204,16 +140,31 @@
       <w:bookmarkEnd w:id="0"/>
     </w:p>
     <w:p>
-      <w:fldSimple w:instr=" MERGEFIELD TableStart:Days ">
-        <w:r>
-          <w:rPr>
-            <w:color w:val="FFFFFF"/>
-            <w:sz w:val="2"/>
-            <w:szCs w:val="2"/>
-          </w:rPr>
-          <w:t>«TableStart:Days»</w:t>
-        </w:r>
-      </w:fldSimple>
+      <w:r>
+        <w:fldChar w:fldCharType="begin"/>
+      </w:r>
+      <w:r>
+        <w:instrText xml:space="preserve"> MERGEFIELD TableStart:Days </w:instrText>
+      </w:r>
+      <w:r>
+        <w:fldChar w:fldCharType="separate"/>
+      </w:r>
+      <w:r>
+        <w:rPr>
+          <w:color w:val="FFFFFF"/>
+          <w:sz w:val="2"/>
+          <w:szCs w:val="2"/>
+        </w:rPr>
+        <w:t>«TableStart:Days»</w:t>
+      </w:r>
+      <w:r>
+        <w:rPr>
+          <w:color w:val="FFFFFF"/>
+          <w:sz w:val="2"/>
+          <w:szCs w:val="2"/>
+        </w:rPr>
+        <w:fldChar w:fldCharType="end"/>
+      </w:r>
     </w:p>
     <w:tbl>
       <w:tblPr>
@@ -245,35 +196,18 @@
             <w:vAlign w:val="center"/>
           </w:tcPr>
           <w:p>
-            <w:r>
-              <w:fldChar w:fldCharType="begin"/>
-            </w:r>
-            <w:r>
-              <w:instrText xml:space="preserve"> MERGEFIELD DayIndex </w:instrText>
-            </w:r>
-            <w:r>
-              <w:fldChar w:fldCharType="separate"/>
-            </w:r>
-            <w:r>
-              <w:rPr>
-                <w:b/>
-                <w:bCs/>
-                <w:color w:val="C9973A"/>
-                <w:sz w:val="30"/>
-                <w:szCs w:val="30"/>
-              </w:rPr>
-              <w:t>«DayIndex»</w:t>
-            </w:r>
-            <w:r>
-              <w:rPr>
-                <w:b/>
-                <w:bCs/>
-                <w:color w:val="C9973A"/>
-                <w:sz w:val="30"/>
-                <w:szCs w:val="30"/>
-              </w:rPr>
-              <w:fldChar w:fldCharType="end"/>
-            </w:r>
+            <w:fldSimple w:instr=" MERGEFIELD DayIndex ">
+              <w:r>
+                <w:rPr>
+                  <w:b/>
+                  <w:bCs/>
+                  <w:color w:val="C9973A"/>
+                  <w:sz w:val="30"/>
+                  <w:szCs w:val="30"/>
+                </w:rPr>
+                <w:t>«DayIndex»</w:t>
+              </w:r>
+            </w:fldSimple>
             <w:r>
               <w:t xml:space="preserve">  </w:t>
             </w:r>
@@ -290,63 +224,31 @@
             <w:pPr>
               <w:spacing w:before="40"/>
             </w:pPr>
-            <w:r>
-              <w:fldChar w:fldCharType="begin"/>
-            </w:r>
-            <w:r>
-              <w:instrText xml:space="preserve"> MERGEFIELD DayDate </w:instrText>
-            </w:r>
-            <w:r>
-              <w:fldChar w:fldCharType="separate"/>
-            </w:r>
-            <w:r>
-              <w:rPr>
-                <w:b/>
-                <w:bCs/>
-                <w:color w:val="FFFFFF"/>
-                <w:sz w:val="20"/>
-                <w:szCs w:val="20"/>
-              </w:rPr>
-              <w:t>«DayDate»</w:t>
-            </w:r>
-            <w:r>
-              <w:rPr>
-                <w:b/>
-                <w:bCs/>
-                <w:color w:val="FFFFFF"/>
-                <w:sz w:val="20"/>
-                <w:szCs w:val="20"/>
-              </w:rPr>
-              <w:fldChar w:fldCharType="end"/>
-            </w:r>
+            <w:fldSimple w:instr=" MERGEFIELD DayDate ">
+              <w:r>
+                <w:rPr>
+                  <w:b/>
+                  <w:bCs/>
+                  <w:color w:val="FFFFFF"/>
+                  <w:sz w:val="20"/>
+                  <w:szCs w:val="20"/>
+                </w:rPr>
+                <w:t>«DayDate»</w:t>
+              </w:r>
+            </w:fldSimple>
             <w:r>
               <w:t xml:space="preserve">　</w:t>
             </w:r>
-            <w:r>
-              <w:fldChar w:fldCharType="begin"/>
-            </w:r>
-            <w:r>
-              <w:instrText xml:space="preserve"> MERGEFIELD DayWeekday </w:instrText>
-            </w:r>
-            <w:r>
-              <w:fldChar w:fldCharType="separate"/>
-            </w:r>
-            <w:r>
-              <w:rPr>
-                <w:color w:val="C7D6DC"/>
-                <w:sz w:val="18"/>
-                <w:szCs w:val="18"/>
-              </w:rPr>
-              <w:t>«DayWeekday»</w:t>
-            </w:r>
-            <w:r>
-              <w:rPr>
-                <w:color w:val="C7D6DC"/>
-                <w:sz w:val="18"/>
-                <w:szCs w:val="18"/>
-              </w:rPr>
-              <w:fldChar w:fldCharType="end"/>
-            </w:r>
+            <w:fldSimple w:instr=" MERGEFIELD DayWeekday ">
+              <w:r>
+                <w:rPr>
+                  <w:color w:val="C7D6DC"/>
+                  <w:sz w:val="18"/>
+                  <w:szCs w:val="18"/>
+                </w:rPr>
+                <w:t>«DayWeekday»</w:t>
+              </w:r>
+            </w:fldSimple>
           </w:p>
         </w:tc>
         <w:tc>
@@ -379,110 +281,81 @@
               <w:spacing w:before="40"/>
               <w:jc w:val="right"/>
             </w:pPr>
-            <w:r>
-              <w:fldChar w:fldCharType="begin"/>
-            </w:r>
-            <w:r>
-              <w:instrText xml:space="preserve"> MERGEFIELD DepartureTime </w:instrText>
-            </w:r>
-            <w:r>
-              <w:fldChar w:fldCharType="separate"/>
-            </w:r>
-            <w:r>
-              <w:rPr>
-                <w:b/>
-                <w:bCs/>
-                <w:color w:val="C9973A"/>
-                <w:sz w:val="24"/>
-                <w:szCs w:val="24"/>
-              </w:rPr>
-              <w:t>«DepartureTime»</w:t>
-            </w:r>
-            <w:r>
-              <w:rPr>
-                <w:b/>
-                <w:bCs/>
-                <w:color w:val="C9973A"/>
-                <w:sz w:val="24"/>
-                <w:szCs w:val="24"/>
-              </w:rPr>
-              <w:fldChar w:fldCharType="end"/>
-            </w:r>
+            <w:fldSimple w:instr=" MERGEFIELD DepartureTime ">
+              <w:r>
+                <w:rPr>
+                  <w:b/>
+                  <w:bCs/>
+                  <w:color w:val="C9973A"/>
+                  <w:sz w:val="24"/>
+                  <w:szCs w:val="24"/>
+                </w:rPr>
+                <w:t>«DepartureTime»</w:t>
+              </w:r>
+            </w:fldSimple>
           </w:p>
         </w:tc>
       </w:tr>
     </w:tbl>
     <w:p>
       <w:pPr>
-        <w:spacing w:before="200"/>
+        <w:pBdr>
+          <w:bottom w:val="single" w:sz="4" w:space="1" w:color="D9D2C2"/>
+        </w:pBdr>
+        <w:spacing w:before="300" w:after="300"/>
       </w:pPr>
+      <w:bookmarkStart w:id="1" w:name="_GoBack"/>
+      <w:bookmarkEnd w:id="1"/>
     </w:p>
     <w:tbl>
       <w:tblPr>
-        <w:tblW w:w="5000" w:type="pct"/>
+        <w:tblStyle w:val="af0"/>
+        <w:tblW w:w="0" w:type="auto"/>
         <w:tblBorders>
-          <w:top w:val="single" w:sz="4" w:space="0" w:color="auto"/>
-          <w:left w:val="single" w:sz="4" w:space="0" w:color="auto"/>
-          <w:bottom w:val="single" w:sz="4" w:space="0" w:color="auto"/>
-          <w:right w:val="single" w:sz="4" w:space="0" w:color="auto"/>
-          <w:insideV w:val="single" w:sz="4" w:space="0" w:color="auto"/>
+          <w:top w:val="none" w:sz="0" w:space="0" w:color="auto"/>
+          <w:left w:val="none" w:sz="0" w:space="0" w:color="auto"/>
+          <w:bottom w:val="none" w:sz="0" w:space="0" w:color="auto"/>
+          <w:right w:val="none" w:sz="0" w:space="0" w:color="auto"/>
+          <w:insideH w:val="none" w:sz="0" w:space="0" w:color="auto"/>
+          <w:insideV w:val="none" w:sz="0" w:space="0" w:color="auto"/>
         </w:tblBorders>
-        <w:tblCellMar>
-          <w:left w:w="10" w:type="dxa"/>
-          <w:right w:w="10" w:type="dxa"/>
-        </w:tblCellMar>
-        <w:tblLook w:val="0000" w:firstRow="0" w:lastRow="0" w:firstColumn="0" w:lastColumn="0" w:noHBand="0" w:noVBand="0"/>
+        <w:tblLook w:val="04A0" w:firstRow="1" w:lastRow="0" w:firstColumn="1" w:lastColumn="0" w:noHBand="0" w:noVBand="1"/>
       </w:tblPr>
       <w:tblGrid>
-        <w:gridCol w:w="4175"/>
-        <w:gridCol w:w="5921"/>
+        <w:gridCol w:w="3764"/>
+        <w:gridCol w:w="6342"/>
       </w:tblGrid>
       <w:tr>
         <w:tc>
           <w:tcPr>
-            <w:tcW w:w="2033" w:type="pct"/>
-            <w:tcMar>
-              <w:top w:w="200" w:type="dxa"/>
-              <w:right w:w="160" w:type="dxa"/>
-            </w:tcMar>
+            <w:tcW w:w="3681" w:type="dxa"/>
           </w:tcPr>
           <w:tbl>
             <w:tblPr>
-              <w:tblpPr w:leftFromText="180" w:rightFromText="180" w:horzAnchor="margin" w:tblpY="-204"/>
-              <w:tblOverlap w:val="never"/>
-              <w:tblW w:w="3995" w:type="dxa"/>
+              <w:tblStyle w:val="af0"/>
+              <w:tblW w:w="0" w:type="auto"/>
               <w:tblBorders>
-                <w:top w:val="single" w:sz="4" w:space="0" w:color="auto"/>
-                <w:left w:val="single" w:sz="4" w:space="0" w:color="auto"/>
-                <w:bottom w:val="single" w:sz="4" w:space="0" w:color="auto"/>
-                <w:right w:val="single" w:sz="4" w:space="0" w:color="auto"/>
-                <w:insideV w:val="single" w:sz="4" w:space="0" w:color="auto"/>
+                <w:top w:val="none" w:sz="0" w:space="0" w:color="auto"/>
+                <w:left w:val="none" w:sz="0" w:space="0" w:color="auto"/>
+                <w:bottom w:val="none" w:sz="0" w:space="0" w:color="auto"/>
+                <w:right w:val="none" w:sz="0" w:space="0" w:color="auto"/>
+                <w:insideH w:val="none" w:sz="0" w:space="0" w:color="auto"/>
+                <w:insideV w:val="none" w:sz="0" w:space="0" w:color="auto"/>
               </w:tblBorders>
-              <w:tblCellMar>
-                <w:left w:w="10" w:type="dxa"/>
-                <w:right w:w="10" w:type="dxa"/>
-              </w:tblCellMar>
-              <w:tblLook w:val="0000" w:firstRow="0" w:lastRow="0" w:firstColumn="0" w:lastColumn="0" w:noHBand="0" w:noVBand="0"/>
+              <w:tblLook w:val="04A0" w:firstRow="1" w:lastRow="0" w:firstColumn="1" w:lastColumn="0" w:noHBand="0" w:noVBand="1"/>
             </w:tblPr>
             <w:tblGrid>
-              <w:gridCol w:w="1360"/>
-              <w:gridCol w:w="300"/>
-              <w:gridCol w:w="2335"/>
+              <w:gridCol w:w="1376"/>
+              <w:gridCol w:w="416"/>
+              <w:gridCol w:w="1756"/>
             </w:tblGrid>
             <w:tr>
-              <w:trPr>
-                <w:cantSplit/>
-                <w:trHeight w:val="1089"/>
-              </w:trPr>
               <w:tc>
                 <w:tcPr>
-                  <w:tcW w:w="1702" w:type="pct"/>
-                  <w:tcMar>
-                    <w:top w:w="120" w:type="dxa"/>
-                    <w:left w:w="100" w:type="dxa"/>
-                    <w:bottom w:w="120" w:type="dxa"/>
-                    <w:right w:w="100" w:type="dxa"/>
-                  </w:tcMar>
+                  <w:tcW w:w="752" w:type="dxa"/>
+                  <w:tcBorders>
+                    <w:right w:val="single" w:sz="18" w:space="0" w:color="C9973A"/>
+                  </w:tcBorders>
                 </w:tcPr>
                 <w:p>
                   <w:r>
@@ -533,7 +406,7 @@
                 </w:p>
                 <w:p>
                   <w:pPr>
-                    <w:jc w:val="right"/>
+                    <w:spacing w:before="300" w:after="300"/>
                   </w:pPr>
                   <w:r>
                     <w:fldChar w:fldCharType="begin"/>
@@ -568,15 +441,15 @@
               </w:tc>
               <w:tc>
                 <w:tcPr>
-                  <w:tcW w:w="375" w:type="pct"/>
-                  <w:tcMar>
-                    <w:top w:w="120" w:type="dxa"/>
-                    <w:left w:w="100" w:type="dxa"/>
-                    <w:bottom w:w="120" w:type="dxa"/>
-                    <w:right w:w="0" w:type="dxa"/>
-                  </w:tcMar>
+                  <w:tcW w:w="416" w:type="dxa"/>
+                  <w:tcBorders>
+                    <w:left w:val="single" w:sz="18" w:space="0" w:color="C9973A"/>
+                  </w:tcBorders>
                 </w:tcPr>
                 <w:p>
+                  <w:pPr>
+                    <w:spacing w:before="300" w:after="300"/>
+                  </w:pPr>
                   <w:r>
                     <w:rPr>
                       <w:b/>
@@ -591,13 +464,7 @@
               </w:tc>
               <w:tc>
                 <w:tcPr>
-                  <w:tcW w:w="2922" w:type="pct"/>
-                  <w:tcMar>
-                    <w:top w:w="120" w:type="dxa"/>
-                    <w:left w:w="160" w:type="dxa"/>
-                    <w:bottom w:w="120" w:type="dxa"/>
-                    <w:right w:w="100" w:type="dxa"/>
-                  </w:tcMar>
+                  <w:tcW w:w="2263" w:type="dxa"/>
                 </w:tcPr>
                 <w:p>
                   <w:r>
@@ -640,7 +507,7 @@
                       <w:sz w:val="18"/>
                       <w:szCs w:val="18"/>
                     </w:rPr>
-                    <w:t xml:space="preserve">停留 </w:t>
+                    <w:t>停留</w:t>
                   </w:r>
                   <w:r>
                     <w:fldChar w:fldCharType="begin"/>
@@ -674,7 +541,7 @@
                       <w:sz w:val="18"/>
                       <w:szCs w:val="18"/>
                     </w:rPr>
-                    <w:t xml:space="preserve"> 分</w:t>
+                    <w:t>分</w:t>
                   </w:r>
                 </w:p>
                 <w:p>
@@ -689,7 +556,7 @@
                       <w:sz w:val="16"/>
                       <w:szCs w:val="16"/>
                     </w:rPr>
-                    <w:t xml:space="preserve">移動時間　</w:t>
+                    <w:t>移動時間</w:t>
                   </w:r>
                   <w:r>
                     <w:fldChar w:fldCharType="begin"/>
@@ -729,83 +596,46 @@
                       <w:sz w:val="16"/>
                       <w:szCs w:val="16"/>
                     </w:rPr>
-                    <w:t xml:space="preserve"> 分</w:t>
-                  </w:r>
-                </w:p>
-                <w:p>
-                  <w:r>
-                    <w:fldChar w:fldCharType="begin"/>
-                  </w:r>
-                  <w:r>
-                    <w:instrText xml:space="preserve"> MERGEFIELD TableEnd:Stops </w:instrText>
-                  </w:r>
-                  <w:r>
-                    <w:fldChar w:fldCharType="separate"/>
+                    <w:t>分</w:t>
                   </w:r>
                   <w:r>
                     <w:rPr>
-                      <w:color w:val="FFFFFF"/>
-                      <w:sz w:val="2"/>
-                      <w:szCs w:val="2"/>
+                      <w:rFonts w:hint="eastAsia"/>
+                      <w:i/>
+                      <w:iCs/>
+                      <w:color w:val="B7B7B7"/>
+                      <w:sz w:val="16"/>
+                      <w:szCs w:val="16"/>
                     </w:rPr>
-                    <w:t>«</w:t>
-                  </w:r>
-                  <w:proofErr w:type="gramStart"/>
-                  <w:r>
-                    <w:rPr>
-                      <w:color w:val="FFFFFF"/>
-                      <w:sz w:val="2"/>
-                      <w:szCs w:val="2"/>
-                    </w:rPr>
-                    <w:t>TableEnd:Stops</w:t>
-                  </w:r>
-                  <w:proofErr w:type="gramEnd"/>
-                  <w:r>
-                    <w:rPr>
-                      <w:color w:val="FFFFFF"/>
-                      <w:sz w:val="2"/>
-                      <w:szCs w:val="2"/>
-                    </w:rPr>
-                    <w:t>»</w:t>
-                  </w:r>
-                  <w:r>
-                    <w:rPr>
-                      <w:color w:val="FFFFFF"/>
-                      <w:sz w:val="2"/>
-                      <w:szCs w:val="2"/>
-                    </w:rPr>
-                    <w:fldChar w:fldCharType="end"/>
-                  </w:r>
+                    <w:t xml:space="preserve"> </w:t>
+                  </w:r>
+                  <w:fldSimple w:instr=" MERGEFIELD TableEnd:Stops ">
+                    <w:r>
+                      <w:rPr>
+                        <w:color w:val="FFFFFF"/>
+                        <w:sz w:val="2"/>
+                        <w:szCs w:val="2"/>
+                      </w:rPr>
+                      <w:t>«TableEnd:Stops»</w:t>
+                    </w:r>
+                  </w:fldSimple>
                 </w:p>
               </w:tc>
             </w:tr>
           </w:tbl>
           <w:p>
             <w:pPr>
-              <w:rPr>
-                <w:rFonts w:hint="eastAsia"/>
-              </w:rPr>
+              <w:spacing w:before="300" w:after="300"/>
             </w:pPr>
           </w:p>
         </w:tc>
         <w:tc>
           <w:tcPr>
-            <w:tcW w:w="2967" w:type="pct"/>
-            <w:tcMar>
-              <w:top w:w="200" w:type="dxa"/>
-              <w:left w:w="0" w:type="dxa"/>
-            </w:tcMar>
+            <w:tcW w:w="6415" w:type="dxa"/>
           </w:tcPr>
           <w:p>
             <w:pPr>
-              <w:rPr>
-                <w:rFonts w:hint="eastAsia"/>
-                <w:i/>
-                <w:iCs/>
-                <w:color w:val="B5B5B5"/>
-                <w:sz w:val="16"/>
-                <w:szCs w:val="16"/>
-              </w:rPr>
+              <w:spacing w:before="300" w:after="300"/>
             </w:pPr>
             <w:r>
               <w:fldChar w:fldCharType="begin"/>
@@ -824,31 +654,7 @@
                 <w:sz w:val="16"/>
                 <w:szCs w:val="16"/>
               </w:rPr>
-              <w:t>«</w:t>
-            </w:r>
-            <w:proofErr w:type="spellStart"/>
-            <w:proofErr w:type="gramStart"/>
-            <w:r>
-              <w:rPr>
-                <w:i/>
-                <w:iCs/>
-                <w:color w:val="B5B5B5"/>
-                <w:sz w:val="16"/>
-                <w:szCs w:val="16"/>
-              </w:rPr>
-              <w:t>Image:DayRouteMap</w:t>
-            </w:r>
-            <w:proofErr w:type="spellEnd"/>
-            <w:proofErr w:type="gramEnd"/>
-            <w:r>
-              <w:rPr>
-                <w:i/>
-                <w:iCs/>
-                <w:color w:val="B5B5B5"/>
-                <w:sz w:val="16"/>
-                <w:szCs w:val="16"/>
-              </w:rPr>
-              <w:t>»</w:t>
+              <w:t>«Image:DayRouteMap»</w:t>
             </w:r>
             <w:r>
               <w:rPr>
@@ -860,8 +666,6 @@
               </w:rPr>
               <w:fldChar w:fldCharType="end"/>
             </w:r>
-            <w:bookmarkStart w:id="1" w:name="_GoBack"/>
-            <w:bookmarkEnd w:id="1"/>
           </w:p>
         </w:tc>
       </w:tr>
@@ -901,950 +705,6 @@
         <w:fldChar w:fldCharType="end"/>
       </w:r>
     </w:p>
-    <w:p>
-      <w:r>
-        <w:br w:type="page"/>
-      </w:r>
-    </w:p>
-    <w:p>
-      <w:pPr>
-        <w:pStyle w:val="1"/>
-        <w:spacing w:after="200"/>
-      </w:pPr>
-      <w:r>
-        <w:rPr>
-          <w:b/>
-          <w:bCs/>
-          <w:color w:val="1B3A4B"/>
-          <w:sz w:val="26"/>
-          <w:szCs w:val="26"/>
-        </w:rPr>
-        <w:lastRenderedPageBreak/>
-        <w:t>附錄：合併欄位對照表</w:t>
-      </w:r>
-    </w:p>
-    <w:p>
-      <w:pPr>
-        <w:spacing w:after="200"/>
-      </w:pPr>
-      <w:proofErr w:type="gramStart"/>
-      <w:r>
-        <w:rPr>
-          <w:color w:val="8A8A8A"/>
-          <w:sz w:val="17"/>
-          <w:szCs w:val="17"/>
-        </w:rPr>
-        <w:t>此頁僅供</w:t>
-      </w:r>
-      <w:proofErr w:type="gramEnd"/>
-      <w:r>
-        <w:rPr>
-          <w:color w:val="8A8A8A"/>
-          <w:sz w:val="17"/>
-          <w:szCs w:val="17"/>
-        </w:rPr>
-        <w:t>設計參考，正式套版時可刪除本頁。</w:t>
-      </w:r>
-    </w:p>
-    <w:tbl>
-      <w:tblPr>
-        <w:tblW w:w="5000" w:type="pct"/>
-        <w:tblBorders>
-          <w:top w:val="single" w:sz="4" w:space="0" w:color="D9D2C2"/>
-          <w:left w:val="single" w:sz="4" w:space="0" w:color="D9D2C2"/>
-          <w:bottom w:val="single" w:sz="4" w:space="0" w:color="D9D2C2"/>
-          <w:right w:val="single" w:sz="4" w:space="0" w:color="D9D2C2"/>
-          <w:insideH w:val="single" w:sz="4" w:space="0" w:color="D9D2C2"/>
-          <w:insideV w:val="single" w:sz="4" w:space="0" w:color="D9D2C2"/>
-        </w:tblBorders>
-        <w:tblCellMar>
-          <w:left w:w="10" w:type="dxa"/>
-          <w:right w:w="10" w:type="dxa"/>
-        </w:tblCellMar>
-        <w:tblLook w:val="0000" w:firstRow="0" w:lastRow="0" w:firstColumn="0" w:lastColumn="0" w:noHBand="0" w:noVBand="0"/>
-      </w:tblPr>
-      <w:tblGrid>
-        <w:gridCol w:w="3534"/>
-        <w:gridCol w:w="6562"/>
-      </w:tblGrid>
-      <w:tr>
-        <w:tc>
-          <w:tcPr>
-            <w:tcW w:w="1750" w:type="pct"/>
-            <w:shd w:val="clear" w:color="auto" w:fill="1B3A4B"/>
-            <w:tcMar>
-              <w:top w:w="80" w:type="dxa"/>
-              <w:left w:w="120" w:type="dxa"/>
-              <w:bottom w:w="80" w:type="dxa"/>
-              <w:right w:w="120" w:type="dxa"/>
-            </w:tcMar>
-          </w:tcPr>
-          <w:p>
-            <w:r>
-              <w:rPr>
-                <w:b/>
-                <w:bCs/>
-                <w:color w:val="FFFFFF"/>
-                <w:sz w:val="19"/>
-                <w:szCs w:val="19"/>
-              </w:rPr>
-              <w:t>欄位名稱 (Merge Field)</w:t>
-            </w:r>
-          </w:p>
-        </w:tc>
-        <w:tc>
-          <w:tcPr>
-            <w:tcW w:w="3250" w:type="pct"/>
-            <w:shd w:val="clear" w:color="auto" w:fill="1B3A4B"/>
-            <w:tcMar>
-              <w:top w:w="80" w:type="dxa"/>
-              <w:left w:w="120" w:type="dxa"/>
-              <w:bottom w:w="80" w:type="dxa"/>
-              <w:right w:w="120" w:type="dxa"/>
-            </w:tcMar>
-          </w:tcPr>
-          <w:p>
-            <w:r>
-              <w:rPr>
-                <w:b/>
-                <w:bCs/>
-                <w:color w:val="FFFFFF"/>
-                <w:sz w:val="19"/>
-                <w:szCs w:val="19"/>
-              </w:rPr>
-              <w:t>說明</w:t>
-            </w:r>
-          </w:p>
-        </w:tc>
-      </w:tr>
-      <w:tr>
-        <w:tc>
-          <w:tcPr>
-            <w:tcW w:w="1750" w:type="pct"/>
-            <w:tcMar>
-              <w:top w:w="80" w:type="dxa"/>
-              <w:left w:w="120" w:type="dxa"/>
-              <w:bottom w:w="80" w:type="dxa"/>
-              <w:right w:w="120" w:type="dxa"/>
-            </w:tcMar>
-          </w:tcPr>
-          <w:p>
-            <w:proofErr w:type="spellStart"/>
-            <w:r>
-              <w:rPr>
-                <w:color w:val="222222"/>
-                <w:sz w:val="19"/>
-                <w:szCs w:val="19"/>
-              </w:rPr>
-              <w:t>TripName</w:t>
-            </w:r>
-            <w:proofErr w:type="spellEnd"/>
-          </w:p>
-        </w:tc>
-        <w:tc>
-          <w:tcPr>
-            <w:tcW w:w="3250" w:type="pct"/>
-            <w:tcMar>
-              <w:top w:w="80" w:type="dxa"/>
-              <w:left w:w="120" w:type="dxa"/>
-              <w:bottom w:w="80" w:type="dxa"/>
-              <w:right w:w="120" w:type="dxa"/>
-            </w:tcMar>
-          </w:tcPr>
-          <w:p>
-            <w:r>
-              <w:rPr>
-                <w:color w:val="222222"/>
-                <w:sz w:val="19"/>
-                <w:szCs w:val="19"/>
-              </w:rPr>
-              <w:t>行程名稱</w:t>
-            </w:r>
-          </w:p>
-        </w:tc>
-      </w:tr>
-      <w:tr>
-        <w:tc>
-          <w:tcPr>
-            <w:tcW w:w="1750" w:type="pct"/>
-            <w:tcMar>
-              <w:top w:w="80" w:type="dxa"/>
-              <w:left w:w="120" w:type="dxa"/>
-              <w:bottom w:w="80" w:type="dxa"/>
-              <w:right w:w="120" w:type="dxa"/>
-            </w:tcMar>
-          </w:tcPr>
-          <w:p>
-            <w:r>
-              <w:rPr>
-                <w:color w:val="222222"/>
-                <w:sz w:val="19"/>
-                <w:szCs w:val="19"/>
-              </w:rPr>
-              <w:t xml:space="preserve">StartDate / </w:t>
-            </w:r>
-            <w:proofErr w:type="spellStart"/>
-            <w:r>
-              <w:rPr>
-                <w:color w:val="222222"/>
-                <w:sz w:val="19"/>
-                <w:szCs w:val="19"/>
-              </w:rPr>
-              <w:t>EndDate</w:t>
-            </w:r>
-            <w:proofErr w:type="spellEnd"/>
-          </w:p>
-        </w:tc>
-        <w:tc>
-          <w:tcPr>
-            <w:tcW w:w="3250" w:type="pct"/>
-            <w:tcMar>
-              <w:top w:w="80" w:type="dxa"/>
-              <w:left w:w="120" w:type="dxa"/>
-              <w:bottom w:w="80" w:type="dxa"/>
-              <w:right w:w="120" w:type="dxa"/>
-            </w:tcMar>
-          </w:tcPr>
-          <w:p>
-            <w:r>
-              <w:rPr>
-                <w:color w:val="222222"/>
-                <w:sz w:val="19"/>
-                <w:szCs w:val="19"/>
-              </w:rPr>
-              <w:t>行程起訖日期</w:t>
-            </w:r>
-          </w:p>
-        </w:tc>
-      </w:tr>
-      <w:tr>
-        <w:tc>
-          <w:tcPr>
-            <w:tcW w:w="1750" w:type="pct"/>
-            <w:tcMar>
-              <w:top w:w="80" w:type="dxa"/>
-              <w:left w:w="120" w:type="dxa"/>
-              <w:bottom w:w="80" w:type="dxa"/>
-              <w:right w:w="120" w:type="dxa"/>
-            </w:tcMar>
-          </w:tcPr>
-          <w:p>
-            <w:proofErr w:type="spellStart"/>
-            <w:r>
-              <w:rPr>
-                <w:color w:val="222222"/>
-                <w:sz w:val="19"/>
-                <w:szCs w:val="19"/>
-              </w:rPr>
-              <w:t>TotalDays</w:t>
-            </w:r>
-            <w:proofErr w:type="spellEnd"/>
-          </w:p>
-        </w:tc>
-        <w:tc>
-          <w:tcPr>
-            <w:tcW w:w="3250" w:type="pct"/>
-            <w:tcMar>
-              <w:top w:w="80" w:type="dxa"/>
-              <w:left w:w="120" w:type="dxa"/>
-              <w:bottom w:w="80" w:type="dxa"/>
-              <w:right w:w="120" w:type="dxa"/>
-            </w:tcMar>
-          </w:tcPr>
-          <w:p>
-            <w:r>
-              <w:rPr>
-                <w:color w:val="222222"/>
-                <w:sz w:val="19"/>
-                <w:szCs w:val="19"/>
-              </w:rPr>
-              <w:t>總天數</w:t>
-            </w:r>
-          </w:p>
-        </w:tc>
-      </w:tr>
-      <w:tr>
-        <w:tc>
-          <w:tcPr>
-            <w:tcW w:w="1750" w:type="pct"/>
-            <w:tcMar>
-              <w:top w:w="80" w:type="dxa"/>
-              <w:left w:w="120" w:type="dxa"/>
-              <w:bottom w:w="80" w:type="dxa"/>
-              <w:right w:w="120" w:type="dxa"/>
-            </w:tcMar>
-          </w:tcPr>
-          <w:p>
-            <w:proofErr w:type="spellStart"/>
-            <w:proofErr w:type="gramStart"/>
-            <w:r>
-              <w:rPr>
-                <w:color w:val="222222"/>
-                <w:sz w:val="19"/>
-                <w:szCs w:val="19"/>
-              </w:rPr>
-              <w:t>Image:CoverImage</w:t>
-            </w:r>
-            <w:proofErr w:type="spellEnd"/>
-            <w:proofErr w:type="gramEnd"/>
-          </w:p>
-        </w:tc>
-        <w:tc>
-          <w:tcPr>
-            <w:tcW w:w="3250" w:type="pct"/>
-            <w:tcMar>
-              <w:top w:w="80" w:type="dxa"/>
-              <w:left w:w="120" w:type="dxa"/>
-              <w:bottom w:w="80" w:type="dxa"/>
-              <w:right w:w="120" w:type="dxa"/>
-            </w:tcMar>
-          </w:tcPr>
-          <w:p>
-            <w:r>
-              <w:rPr>
-                <w:color w:val="222222"/>
-                <w:sz w:val="19"/>
-                <w:szCs w:val="19"/>
-              </w:rPr>
-              <w:t>封面圖片（選用，需自行以圖片合併方式處理）</w:t>
-            </w:r>
-          </w:p>
-        </w:tc>
-      </w:tr>
-      <w:tr>
-        <w:tc>
-          <w:tcPr>
-            <w:tcW w:w="1750" w:type="pct"/>
-            <w:tcMar>
-              <w:top w:w="80" w:type="dxa"/>
-              <w:left w:w="120" w:type="dxa"/>
-              <w:bottom w:w="80" w:type="dxa"/>
-              <w:right w:w="120" w:type="dxa"/>
-            </w:tcMar>
-          </w:tcPr>
-          <w:p>
-            <w:proofErr w:type="spellStart"/>
-            <w:proofErr w:type="gramStart"/>
-            <w:r>
-              <w:rPr>
-                <w:color w:val="222222"/>
-                <w:sz w:val="19"/>
-                <w:szCs w:val="19"/>
-              </w:rPr>
-              <w:t>TableStart:Days</w:t>
-            </w:r>
-            <w:proofErr w:type="spellEnd"/>
-            <w:proofErr w:type="gramEnd"/>
-            <w:r>
-              <w:rPr>
-                <w:color w:val="222222"/>
-                <w:sz w:val="19"/>
-                <w:szCs w:val="19"/>
-              </w:rPr>
-              <w:t xml:space="preserve"> / </w:t>
-            </w:r>
-            <w:proofErr w:type="spellStart"/>
-            <w:r>
-              <w:rPr>
-                <w:color w:val="222222"/>
-                <w:sz w:val="19"/>
-                <w:szCs w:val="19"/>
-              </w:rPr>
-              <w:t>TableEnd:Days</w:t>
-            </w:r>
-            <w:proofErr w:type="spellEnd"/>
-          </w:p>
-        </w:tc>
-        <w:tc>
-          <w:tcPr>
-            <w:tcW w:w="3250" w:type="pct"/>
-            <w:tcMar>
-              <w:top w:w="80" w:type="dxa"/>
-              <w:left w:w="120" w:type="dxa"/>
-              <w:bottom w:w="80" w:type="dxa"/>
-              <w:right w:w="120" w:type="dxa"/>
-            </w:tcMar>
-          </w:tcPr>
-          <w:p>
-            <w:r>
-              <w:rPr>
-                <w:color w:val="222222"/>
-                <w:sz w:val="19"/>
-                <w:szCs w:val="19"/>
-              </w:rPr>
-              <w:t>「天」的巢狀合併區域，一個 Days 資料列 = 一天</w:t>
-            </w:r>
-          </w:p>
-        </w:tc>
-      </w:tr>
-      <w:tr>
-        <w:tc>
-          <w:tcPr>
-            <w:tcW w:w="1750" w:type="pct"/>
-            <w:tcMar>
-              <w:top w:w="80" w:type="dxa"/>
-              <w:left w:w="120" w:type="dxa"/>
-              <w:bottom w:w="80" w:type="dxa"/>
-              <w:right w:w="120" w:type="dxa"/>
-            </w:tcMar>
-          </w:tcPr>
-          <w:p>
-            <w:proofErr w:type="spellStart"/>
-            <w:r>
-              <w:rPr>
-                <w:color w:val="222222"/>
-                <w:sz w:val="19"/>
-                <w:szCs w:val="19"/>
-              </w:rPr>
-              <w:t>DayIndex</w:t>
-            </w:r>
-            <w:proofErr w:type="spellEnd"/>
-          </w:p>
-        </w:tc>
-        <w:tc>
-          <w:tcPr>
-            <w:tcW w:w="3250" w:type="pct"/>
-            <w:tcMar>
-              <w:top w:w="80" w:type="dxa"/>
-              <w:left w:w="120" w:type="dxa"/>
-              <w:bottom w:w="80" w:type="dxa"/>
-              <w:right w:w="120" w:type="dxa"/>
-            </w:tcMar>
-          </w:tcPr>
-          <w:p>
-            <w:r>
-              <w:rPr>
-                <w:color w:val="222222"/>
-                <w:sz w:val="19"/>
-                <w:szCs w:val="19"/>
-              </w:rPr>
-              <w:t>第幾天（1, 2, 3…）</w:t>
-            </w:r>
-          </w:p>
-        </w:tc>
-      </w:tr>
-      <w:tr>
-        <w:tc>
-          <w:tcPr>
-            <w:tcW w:w="1750" w:type="pct"/>
-            <w:tcMar>
-              <w:top w:w="80" w:type="dxa"/>
-              <w:left w:w="120" w:type="dxa"/>
-              <w:bottom w:w="80" w:type="dxa"/>
-              <w:right w:w="120" w:type="dxa"/>
-            </w:tcMar>
-          </w:tcPr>
-          <w:p>
-            <w:proofErr w:type="spellStart"/>
-            <w:r>
-              <w:rPr>
-                <w:color w:val="222222"/>
-                <w:sz w:val="19"/>
-                <w:szCs w:val="19"/>
-              </w:rPr>
-              <w:t>DayDate</w:t>
-            </w:r>
-            <w:proofErr w:type="spellEnd"/>
-          </w:p>
-        </w:tc>
-        <w:tc>
-          <w:tcPr>
-            <w:tcW w:w="3250" w:type="pct"/>
-            <w:tcMar>
-              <w:top w:w="80" w:type="dxa"/>
-              <w:left w:w="120" w:type="dxa"/>
-              <w:bottom w:w="80" w:type="dxa"/>
-              <w:right w:w="120" w:type="dxa"/>
-            </w:tcMar>
-          </w:tcPr>
-          <w:p>
-            <w:r>
-              <w:rPr>
-                <w:color w:val="222222"/>
-                <w:sz w:val="19"/>
-                <w:szCs w:val="19"/>
-              </w:rPr>
-              <w:t>當天日期</w:t>
-            </w:r>
-            <w:proofErr w:type="gramStart"/>
-            <w:r>
-              <w:rPr>
-                <w:color w:val="222222"/>
-                <w:sz w:val="19"/>
-                <w:szCs w:val="19"/>
-              </w:rPr>
-              <w:t>（</w:t>
-            </w:r>
-            <w:proofErr w:type="gramEnd"/>
-            <w:r>
-              <w:rPr>
-                <w:color w:val="222222"/>
-                <w:sz w:val="19"/>
-                <w:szCs w:val="19"/>
-              </w:rPr>
-              <w:t>例：7月07日</w:t>
-            </w:r>
-            <w:proofErr w:type="gramStart"/>
-            <w:r>
-              <w:rPr>
-                <w:color w:val="222222"/>
-                <w:sz w:val="19"/>
-                <w:szCs w:val="19"/>
-              </w:rPr>
-              <w:t>）</w:t>
-            </w:r>
-            <w:proofErr w:type="gramEnd"/>
-          </w:p>
-        </w:tc>
-      </w:tr>
-      <w:tr>
-        <w:tc>
-          <w:tcPr>
-            <w:tcW w:w="1750" w:type="pct"/>
-            <w:tcMar>
-              <w:top w:w="80" w:type="dxa"/>
-              <w:left w:w="120" w:type="dxa"/>
-              <w:bottom w:w="80" w:type="dxa"/>
-              <w:right w:w="120" w:type="dxa"/>
-            </w:tcMar>
-          </w:tcPr>
-          <w:p>
-            <w:proofErr w:type="spellStart"/>
-            <w:r>
-              <w:rPr>
-                <w:color w:val="222222"/>
-                <w:sz w:val="19"/>
-                <w:szCs w:val="19"/>
-              </w:rPr>
-              <w:t>DayWeekday</w:t>
-            </w:r>
-            <w:proofErr w:type="spellEnd"/>
-          </w:p>
-        </w:tc>
-        <w:tc>
-          <w:tcPr>
-            <w:tcW w:w="3250" w:type="pct"/>
-            <w:tcMar>
-              <w:top w:w="80" w:type="dxa"/>
-              <w:left w:w="120" w:type="dxa"/>
-              <w:bottom w:w="80" w:type="dxa"/>
-              <w:right w:w="120" w:type="dxa"/>
-            </w:tcMar>
-          </w:tcPr>
-          <w:p>
-            <w:r>
-              <w:rPr>
-                <w:color w:val="222222"/>
-                <w:sz w:val="19"/>
-                <w:szCs w:val="19"/>
-              </w:rPr>
-              <w:t>星期幾（選用，無資料可留空）</w:t>
-            </w:r>
-          </w:p>
-        </w:tc>
-      </w:tr>
-      <w:tr>
-        <w:tc>
-          <w:tcPr>
-            <w:tcW w:w="1750" w:type="pct"/>
-            <w:tcMar>
-              <w:top w:w="80" w:type="dxa"/>
-              <w:left w:w="120" w:type="dxa"/>
-              <w:bottom w:w="80" w:type="dxa"/>
-              <w:right w:w="120" w:type="dxa"/>
-            </w:tcMar>
-          </w:tcPr>
-          <w:p>
-            <w:proofErr w:type="spellStart"/>
-            <w:r>
-              <w:rPr>
-                <w:color w:val="222222"/>
-                <w:sz w:val="19"/>
-                <w:szCs w:val="19"/>
-              </w:rPr>
-              <w:t>DepartureTime</w:t>
-            </w:r>
-            <w:proofErr w:type="spellEnd"/>
-          </w:p>
-        </w:tc>
-        <w:tc>
-          <w:tcPr>
-            <w:tcW w:w="3250" w:type="pct"/>
-            <w:tcMar>
-              <w:top w:w="80" w:type="dxa"/>
-              <w:left w:w="120" w:type="dxa"/>
-              <w:bottom w:w="80" w:type="dxa"/>
-              <w:right w:w="120" w:type="dxa"/>
-            </w:tcMar>
-          </w:tcPr>
-          <w:p>
-            <w:r>
-              <w:rPr>
-                <w:color w:val="222222"/>
-                <w:sz w:val="19"/>
-                <w:szCs w:val="19"/>
-              </w:rPr>
-              <w:t>當天出發時間</w:t>
-            </w:r>
-          </w:p>
-        </w:tc>
-      </w:tr>
-      <w:tr>
-        <w:tc>
-          <w:tcPr>
-            <w:tcW w:w="1750" w:type="pct"/>
-            <w:tcMar>
-              <w:top w:w="80" w:type="dxa"/>
-              <w:left w:w="120" w:type="dxa"/>
-              <w:bottom w:w="80" w:type="dxa"/>
-              <w:right w:w="120" w:type="dxa"/>
-            </w:tcMar>
-          </w:tcPr>
-          <w:p>
-            <w:proofErr w:type="spellStart"/>
-            <w:proofErr w:type="gramStart"/>
-            <w:r>
-              <w:rPr>
-                <w:color w:val="222222"/>
-                <w:sz w:val="19"/>
-                <w:szCs w:val="19"/>
-              </w:rPr>
-              <w:t>Image:DayRouteMap</w:t>
-            </w:r>
-            <w:proofErr w:type="spellEnd"/>
-            <w:proofErr w:type="gramEnd"/>
-          </w:p>
-        </w:tc>
-        <w:tc>
-          <w:tcPr>
-            <w:tcW w:w="3250" w:type="pct"/>
-            <w:tcMar>
-              <w:top w:w="80" w:type="dxa"/>
-              <w:left w:w="120" w:type="dxa"/>
-              <w:bottom w:w="80" w:type="dxa"/>
-              <w:right w:w="120" w:type="dxa"/>
-            </w:tcMar>
-          </w:tcPr>
-          <w:p>
-            <w:r>
-              <w:rPr>
-                <w:color w:val="222222"/>
-                <w:sz w:val="19"/>
-                <w:szCs w:val="19"/>
-              </w:rPr>
-              <w:t>當天路線地圖圖片（選用）</w:t>
-            </w:r>
-          </w:p>
-        </w:tc>
-      </w:tr>
-      <w:tr>
-        <w:tc>
-          <w:tcPr>
-            <w:tcW w:w="1750" w:type="pct"/>
-            <w:tcMar>
-              <w:top w:w="80" w:type="dxa"/>
-              <w:left w:w="120" w:type="dxa"/>
-              <w:bottom w:w="80" w:type="dxa"/>
-              <w:right w:w="120" w:type="dxa"/>
-            </w:tcMar>
-          </w:tcPr>
-          <w:p>
-            <w:proofErr w:type="spellStart"/>
-            <w:proofErr w:type="gramStart"/>
-            <w:r>
-              <w:rPr>
-                <w:color w:val="222222"/>
-                <w:sz w:val="19"/>
-                <w:szCs w:val="19"/>
-              </w:rPr>
-              <w:t>TableStart:Stops</w:t>
-            </w:r>
-            <w:proofErr w:type="spellEnd"/>
-            <w:proofErr w:type="gramEnd"/>
-            <w:r>
-              <w:rPr>
-                <w:color w:val="222222"/>
-                <w:sz w:val="19"/>
-                <w:szCs w:val="19"/>
-              </w:rPr>
-              <w:t xml:space="preserve"> / </w:t>
-            </w:r>
-            <w:proofErr w:type="spellStart"/>
-            <w:r>
-              <w:rPr>
-                <w:color w:val="222222"/>
-                <w:sz w:val="19"/>
-                <w:szCs w:val="19"/>
-              </w:rPr>
-              <w:t>TableEnd:Stops</w:t>
-            </w:r>
-            <w:proofErr w:type="spellEnd"/>
-          </w:p>
-        </w:tc>
-        <w:tc>
-          <w:tcPr>
-            <w:tcW w:w="3250" w:type="pct"/>
-            <w:tcMar>
-              <w:top w:w="80" w:type="dxa"/>
-              <w:left w:w="120" w:type="dxa"/>
-              <w:bottom w:w="80" w:type="dxa"/>
-              <w:right w:w="120" w:type="dxa"/>
-            </w:tcMar>
-          </w:tcPr>
-          <w:p>
-            <w:r>
-              <w:rPr>
-                <w:color w:val="222222"/>
-                <w:sz w:val="19"/>
-                <w:szCs w:val="19"/>
-              </w:rPr>
-              <w:t>「停留點」的巢狀合併區域，須放在 Days 區域「</w:t>
-            </w:r>
-            <w:proofErr w:type="gramStart"/>
-            <w:r>
-              <w:rPr>
-                <w:color w:val="222222"/>
-                <w:sz w:val="19"/>
-                <w:szCs w:val="19"/>
-              </w:rPr>
-              <w:t>內部」</w:t>
-            </w:r>
-            <w:proofErr w:type="gramEnd"/>
-          </w:p>
-        </w:tc>
-      </w:tr>
-      <w:tr>
-        <w:tc>
-          <w:tcPr>
-            <w:tcW w:w="1750" w:type="pct"/>
-            <w:tcMar>
-              <w:top w:w="80" w:type="dxa"/>
-              <w:left w:w="120" w:type="dxa"/>
-              <w:bottom w:w="80" w:type="dxa"/>
-              <w:right w:w="120" w:type="dxa"/>
-            </w:tcMar>
-          </w:tcPr>
-          <w:p>
-            <w:proofErr w:type="spellStart"/>
-            <w:r>
-              <w:rPr>
-                <w:color w:val="222222"/>
-                <w:sz w:val="19"/>
-                <w:szCs w:val="19"/>
-              </w:rPr>
-              <w:t>StopTime</w:t>
-            </w:r>
-            <w:proofErr w:type="spellEnd"/>
-          </w:p>
-        </w:tc>
-        <w:tc>
-          <w:tcPr>
-            <w:tcW w:w="3250" w:type="pct"/>
-            <w:tcMar>
-              <w:top w:w="80" w:type="dxa"/>
-              <w:left w:w="120" w:type="dxa"/>
-              <w:bottom w:w="80" w:type="dxa"/>
-              <w:right w:w="120" w:type="dxa"/>
-            </w:tcMar>
-          </w:tcPr>
-          <w:p>
-            <w:r>
-              <w:rPr>
-                <w:color w:val="222222"/>
-                <w:sz w:val="19"/>
-                <w:szCs w:val="19"/>
-              </w:rPr>
-              <w:t>抵達時間</w:t>
-            </w:r>
-          </w:p>
-        </w:tc>
-      </w:tr>
-      <w:tr>
-        <w:tc>
-          <w:tcPr>
-            <w:tcW w:w="1750" w:type="pct"/>
-            <w:tcMar>
-              <w:top w:w="80" w:type="dxa"/>
-              <w:left w:w="120" w:type="dxa"/>
-              <w:bottom w:w="80" w:type="dxa"/>
-              <w:right w:w="120" w:type="dxa"/>
-            </w:tcMar>
-          </w:tcPr>
-          <w:p>
-            <w:proofErr w:type="spellStart"/>
-            <w:r>
-              <w:rPr>
-                <w:color w:val="222222"/>
-                <w:sz w:val="19"/>
-                <w:szCs w:val="19"/>
-              </w:rPr>
-              <w:t>StopName</w:t>
-            </w:r>
-            <w:proofErr w:type="spellEnd"/>
-          </w:p>
-        </w:tc>
-        <w:tc>
-          <w:tcPr>
-            <w:tcW w:w="3250" w:type="pct"/>
-            <w:tcMar>
-              <w:top w:w="80" w:type="dxa"/>
-              <w:left w:w="120" w:type="dxa"/>
-              <w:bottom w:w="80" w:type="dxa"/>
-              <w:right w:w="120" w:type="dxa"/>
-            </w:tcMar>
-          </w:tcPr>
-          <w:p>
-            <w:r>
-              <w:rPr>
-                <w:color w:val="222222"/>
-                <w:sz w:val="19"/>
-                <w:szCs w:val="19"/>
-              </w:rPr>
-              <w:t>地點名稱</w:t>
-            </w:r>
-          </w:p>
-        </w:tc>
-      </w:tr>
-      <w:tr>
-        <w:tc>
-          <w:tcPr>
-            <w:tcW w:w="1750" w:type="pct"/>
-            <w:tcMar>
-              <w:top w:w="80" w:type="dxa"/>
-              <w:left w:w="120" w:type="dxa"/>
-              <w:bottom w:w="80" w:type="dxa"/>
-              <w:right w:w="120" w:type="dxa"/>
-            </w:tcMar>
-          </w:tcPr>
-          <w:p>
-            <w:proofErr w:type="spellStart"/>
-            <w:r>
-              <w:rPr>
-                <w:color w:val="222222"/>
-                <w:sz w:val="19"/>
-                <w:szCs w:val="19"/>
-              </w:rPr>
-              <w:t>StopDuration</w:t>
-            </w:r>
-            <w:proofErr w:type="spellEnd"/>
-          </w:p>
-        </w:tc>
-        <w:tc>
-          <w:tcPr>
-            <w:tcW w:w="3250" w:type="pct"/>
-            <w:tcMar>
-              <w:top w:w="80" w:type="dxa"/>
-              <w:left w:w="120" w:type="dxa"/>
-              <w:bottom w:w="80" w:type="dxa"/>
-              <w:right w:w="120" w:type="dxa"/>
-            </w:tcMar>
-          </w:tcPr>
-          <w:p>
-            <w:r>
-              <w:rPr>
-                <w:color w:val="222222"/>
-                <w:sz w:val="19"/>
-                <w:szCs w:val="19"/>
-              </w:rPr>
-              <w:t>停留時間</w:t>
-            </w:r>
-            <w:proofErr w:type="gramStart"/>
-            <w:r>
-              <w:rPr>
-                <w:color w:val="222222"/>
-                <w:sz w:val="19"/>
-                <w:szCs w:val="19"/>
-              </w:rPr>
-              <w:t>（</w:t>
-            </w:r>
-            <w:proofErr w:type="gramEnd"/>
-            <w:r>
-              <w:rPr>
-                <w:color w:val="222222"/>
-                <w:sz w:val="19"/>
-                <w:szCs w:val="19"/>
-              </w:rPr>
-              <w:t>例：30分鐘</w:t>
-            </w:r>
-            <w:proofErr w:type="gramStart"/>
-            <w:r>
-              <w:rPr>
-                <w:color w:val="222222"/>
-                <w:sz w:val="19"/>
-                <w:szCs w:val="19"/>
-              </w:rPr>
-              <w:t>）</w:t>
-            </w:r>
-            <w:proofErr w:type="gramEnd"/>
-          </w:p>
-        </w:tc>
-      </w:tr>
-      <w:tr>
-        <w:tc>
-          <w:tcPr>
-            <w:tcW w:w="1750" w:type="pct"/>
-            <w:tcMar>
-              <w:top w:w="80" w:type="dxa"/>
-              <w:left w:w="120" w:type="dxa"/>
-              <w:bottom w:w="80" w:type="dxa"/>
-              <w:right w:w="120" w:type="dxa"/>
-            </w:tcMar>
-          </w:tcPr>
-          <w:p>
-            <w:proofErr w:type="spellStart"/>
-            <w:r>
-              <w:rPr>
-                <w:color w:val="222222"/>
-                <w:sz w:val="19"/>
-                <w:szCs w:val="19"/>
-              </w:rPr>
-              <w:t>TravelTimeToNext</w:t>
-            </w:r>
-            <w:proofErr w:type="spellEnd"/>
-          </w:p>
-        </w:tc>
-        <w:tc>
-          <w:tcPr>
-            <w:tcW w:w="3250" w:type="pct"/>
-            <w:tcMar>
-              <w:top w:w="80" w:type="dxa"/>
-              <w:left w:w="120" w:type="dxa"/>
-              <w:bottom w:w="80" w:type="dxa"/>
-              <w:right w:w="120" w:type="dxa"/>
-            </w:tcMar>
-          </w:tcPr>
-          <w:p>
-            <w:r>
-              <w:rPr>
-                <w:color w:val="222222"/>
-                <w:sz w:val="19"/>
-                <w:szCs w:val="19"/>
-              </w:rPr>
-              <w:t>前往下一站所需時間；最後一站可</w:t>
-            </w:r>
-            <w:proofErr w:type="gramStart"/>
-            <w:r>
-              <w:rPr>
-                <w:color w:val="222222"/>
-                <w:sz w:val="19"/>
-                <w:szCs w:val="19"/>
-              </w:rPr>
-              <w:t>留空由程式</w:t>
-            </w:r>
-            <w:proofErr w:type="gramEnd"/>
-            <w:r>
-              <w:rPr>
-                <w:color w:val="222222"/>
-                <w:sz w:val="19"/>
-                <w:szCs w:val="19"/>
-              </w:rPr>
-              <w:t>判斷不顯示</w:t>
-            </w:r>
-          </w:p>
-        </w:tc>
-      </w:tr>
-    </w:tbl>
-    <w:p/>
     <w:sectPr>
       <w:headerReference w:type="default" r:id="rId7"/>
       <w:footerReference w:type="default" r:id="rId8"/>
@@ -2770,6 +1630,22 @@
       <w:szCs w:val="20"/>
     </w:rPr>
   </w:style>
+  <w:style w:type="table" w:styleId="af0">
+    <w:name w:val="Table Grid"/>
+    <w:basedOn w:val="a1"/>
+    <w:uiPriority w:val="39"/>
+    <w:rsid w:val="00E2621D"/>
+    <w:tblPr>
+      <w:tblBorders>
+        <w:top w:val="single" w:sz="4" w:space="0" w:color="auto"/>
+        <w:left w:val="single" w:sz="4" w:space="0" w:color="auto"/>
+        <w:bottom w:val="single" w:sz="4" w:space="0" w:color="auto"/>
+        <w:right w:val="single" w:sz="4" w:space="0" w:color="auto"/>
+        <w:insideH w:val="single" w:sz="4" w:space="0" w:color="auto"/>
+        <w:insideV w:val="single" w:sz="4" w:space="0" w:color="auto"/>
+      </w:tblBorders>
+    </w:tblPr>
+  </w:style>
 </w:styles>
 </file>
 

</xml_diff>